<commit_message>
fix(onsite): drop the internal stand-in TODO from the Day 1 demo document
treaty-layer-summary.txt carried an internal "[STAND-IN — swap for the
genericized Gen Re source document…]" note as line 3. The file ships
inside workshop-folder.zip, so every participant had it open in Word
while the facilitator demoed off it.

Removed the line, regenerated the .docx via convert-lab-files.py, and
rebuilt the zip. The stand-in status stays recorded where it belongs, in
facilitator-guide.html and day-1-script.md.

Verified from the extracted .docx: 6 .docx + claude.md, no .txt, single
cowork-workshop/ root, and both planted defects survive — layer premiums
sum to $4,440,000 against a stated $4,405,000, and Article 14 still reads
2 October against renewal terms issued 15 October.

Co-Authored-By: Claude Fable 5 <noreply@anthropic.com>
</commit_message>
<xml_diff>
--- a/assets/workshop-folder/demo/treaty-layer-summary.docx
+++ b/assets/workshop-folder/demo/treaty-layer-summary.docx
@@ -8,11 +8,6 @@
       </w:pPr>
       <w:r>
         <w:t>Quarterly Treaty-Layer Summary — Larkspur Mutual Insurance Company</w:t>
-      </w:r>
-    </w:p>
-    <w:p>
-      <w:r>
-        <w:t>[STAND-IN — swap for the genericized Gen Re source document when received; see facilitator guide TODO]</w:t>
       </w:r>
     </w:p>
     <w:p>

</xml_diff>